<commit_message>
Merge + cambios de código (sin archivos generados/pesados)
</commit_message>
<xml_diff>
--- a/backend/uploads/examen_ordinario_I_UNAMBA_2023.docx
+++ b/backend/uploads/examen_ordinario_I_UNAMBA_2023.docx
@@ -1339,8 +1339,9 @@
           <w:sz w:val="24"/>
           <w:szCs w:val="24"/>
         </w:rPr>
-        <w:t>Lo que cobra y gasta diariamente un individuo suman S/.900.  Lo que gasta y cobra están en la relación de 2 a 3  ¿</w:t>
-      </w:r>
+        <w:t xml:space="preserve">Lo que cobra y gasta diariamente un individuo suman S/.900.  Lo que gasta y cobra están en la relación de 2 a </w:t>
+      </w:r>
+      <w:proofErr w:type="gramStart"/>
       <w:r>
         <w:rPr>
           <w:rFonts w:ascii="Times New Roman" w:hAnsi="Times New Roman" w:cs="Times New Roman"/>
@@ -1348,6 +1349,16 @@
           <w:sz w:val="24"/>
           <w:szCs w:val="24"/>
         </w:rPr>
+        <w:t>3  ¿</w:t>
+      </w:r>
+      <w:proofErr w:type="gramEnd"/>
+      <w:r>
+        <w:rPr>
+          <w:rFonts w:ascii="Times New Roman" w:hAnsi="Times New Roman" w:cs="Times New Roman"/>
+          <w:color w:val="0D0D0D" w:themeColor="text1" w:themeTint="F2"/>
+          <w:sz w:val="24"/>
+          <w:szCs w:val="24"/>
+        </w:rPr>
         <w:t>e</w:t>
       </w:r>
       <w:r>
@@ -1543,8 +1554,9 @@
           <w:sz w:val="24"/>
           <w:szCs w:val="24"/>
         </w:rPr>
-        <w:t>Un superpanetón en forma de paralele</w:t>
-      </w:r>
+        <w:t xml:space="preserve">Un </w:t>
+      </w:r>
+      <w:proofErr w:type="spellStart"/>
       <w:r>
         <w:rPr>
           <w:rFonts w:ascii="Times New Roman" w:hAnsi="Times New Roman" w:cs="Times New Roman"/>
@@ -1552,6 +1564,25 @@
           <w:sz w:val="24"/>
           <w:szCs w:val="24"/>
         </w:rPr>
+        <w:t>superpanetón</w:t>
+      </w:r>
+      <w:proofErr w:type="spellEnd"/>
+      <w:r>
+        <w:rPr>
+          <w:rFonts w:ascii="Times New Roman" w:hAnsi="Times New Roman" w:cs="Times New Roman"/>
+          <w:color w:val="0D0D0D" w:themeColor="text1" w:themeTint="F2"/>
+          <w:sz w:val="24"/>
+          <w:szCs w:val="24"/>
+        </w:rPr>
+        <w:t xml:space="preserve"> en forma de paralele</w:t>
+      </w:r>
+      <w:r>
+        <w:rPr>
+          <w:rFonts w:ascii="Times New Roman" w:hAnsi="Times New Roman" w:cs="Times New Roman"/>
+          <w:color w:val="0D0D0D" w:themeColor="text1" w:themeTint="F2"/>
+          <w:sz w:val="24"/>
+          <w:szCs w:val="24"/>
+        </w:rPr>
         <w:t>p</w:t>
       </w:r>
       <w:r>
@@ -1616,7 +1647,27 @@
           <w:sz w:val="24"/>
           <w:szCs w:val="24"/>
         </w:rPr>
-        <w:t>. El volumen de un minipanetón de igual forma, pero con dimensiones reducidas a</w:t>
+        <w:t xml:space="preserve">. El volumen de un </w:t>
+      </w:r>
+      <w:proofErr w:type="spellStart"/>
+      <w:r>
+        <w:rPr>
+          <w:rFonts w:ascii="Times New Roman" w:hAnsi="Times New Roman" w:cs="Times New Roman"/>
+          <w:color w:val="0D0D0D" w:themeColor="text1" w:themeTint="F2"/>
+          <w:sz w:val="24"/>
+          <w:szCs w:val="24"/>
+        </w:rPr>
+        <w:t>minipanetón</w:t>
+      </w:r>
+      <w:proofErr w:type="spellEnd"/>
+      <w:r>
+        <w:rPr>
+          <w:rFonts w:ascii="Times New Roman" w:hAnsi="Times New Roman" w:cs="Times New Roman"/>
+          <w:color w:val="0D0D0D" w:themeColor="text1" w:themeTint="F2"/>
+          <w:sz w:val="24"/>
+          <w:szCs w:val="24"/>
+        </w:rPr>
+        <w:t xml:space="preserve"> de igual forma, pero con dimensiones reducidas a</w:t>
       </w:r>
       <w:r>
         <w:rPr>
@@ -2416,7 +2467,27 @@
           <w:sz w:val="24"/>
           <w:szCs w:val="24"/>
         </w:rPr>
-        <w:t>Tenía 40 cuadernos.  A mi amigo Julio le dí 20%, a mi primo Pedro el 30% y a m</w:t>
+        <w:t xml:space="preserve">Tenía 40 cuadernos.  A mi amigo Julio le </w:t>
+      </w:r>
+      <w:proofErr w:type="spellStart"/>
+      <w:r>
+        <w:rPr>
+          <w:rFonts w:ascii="Times New Roman" w:hAnsi="Times New Roman" w:cs="Times New Roman"/>
+          <w:color w:val="0D0D0D" w:themeColor="text1" w:themeTint="F2"/>
+          <w:sz w:val="24"/>
+          <w:szCs w:val="24"/>
+        </w:rPr>
+        <w:t>dí</w:t>
+      </w:r>
+      <w:proofErr w:type="spellEnd"/>
+      <w:r>
+        <w:rPr>
+          <w:rFonts w:ascii="Times New Roman" w:hAnsi="Times New Roman" w:cs="Times New Roman"/>
+          <w:color w:val="0D0D0D" w:themeColor="text1" w:themeTint="F2"/>
+          <w:sz w:val="24"/>
+          <w:szCs w:val="24"/>
+        </w:rPr>
+        <w:t xml:space="preserve"> 20%, a mi primo Pedro el 30% y a m</w:t>
       </w:r>
       <w:r>
         <w:rPr>
@@ -5147,7 +5218,7 @@
           <w:lang w:eastAsia="es-PE"/>
         </w:rPr>
         <w:drawing>
-          <wp:anchor distT="0" distB="0" distL="114300" distR="114300" simplePos="0" relativeHeight="251661312" behindDoc="0" locked="0" layoutInCell="1" allowOverlap="1" wp14:anchorId="666557DC" wp14:editId="58E870CE">
+          <wp:anchor distT="0" distB="0" distL="114300" distR="114300" simplePos="0" relativeHeight="251661312" behindDoc="0" locked="0" layoutInCell="1" allowOverlap="1" wp14:anchorId="666557DC" wp14:editId="06D447E0">
             <wp:simplePos x="0" y="0"/>
             <wp:positionH relativeFrom="column">
               <wp:posOffset>2148866</wp:posOffset>
@@ -15109,14 +15180,16 @@
           <w:szCs w:val="24"/>
         </w:rPr>
       </w:pPr>
-      <w:r>
-        <w:rPr>
-          <w:rFonts w:ascii="Times New Roman" w:hAnsi="Times New Roman" w:cs="Times New Roman"/>
-          <w:sz w:val="24"/>
-          <w:szCs w:val="24"/>
-        </w:rPr>
-        <w:t>5</w:t>
-      </w:r>
+      <w:proofErr w:type="spellStart"/>
+      <w:r>
+        <w:rPr>
+          <w:rFonts w:ascii="Times New Roman" w:hAnsi="Times New Roman" w:cs="Times New Roman"/>
+          <w:sz w:val="24"/>
+          <w:szCs w:val="24"/>
+        </w:rPr>
+        <w:t>ó</w:t>
+      </w:r>
+      <w:proofErr w:type="spellEnd"/>
     </w:p>
     <w:p>
       <w:pPr>
@@ -15756,8 +15829,9 @@
           <w:sz w:val="24"/>
           <w:szCs w:val="24"/>
         </w:rPr>
-        <w:t>coma vocativ</w:t>
-      </w:r>
+        <w:t xml:space="preserve">coma </w:t>
+      </w:r>
+      <w:proofErr w:type="spellStart"/>
       <w:r>
         <w:rPr>
           <w:rFonts w:ascii="Times New Roman" w:hAnsi="Times New Roman" w:cs="Times New Roman"/>
@@ -15765,8 +15839,18 @@
           <w:sz w:val="24"/>
           <w:szCs w:val="24"/>
         </w:rPr>
+        <w:t>vocativ</w:t>
+      </w:r>
+      <w:r>
+        <w:rPr>
+          <w:rFonts w:ascii="Times New Roman" w:hAnsi="Times New Roman" w:cs="Times New Roman"/>
+          <w:b/>
+          <w:sz w:val="24"/>
+          <w:szCs w:val="24"/>
+        </w:rPr>
         <w:t>a</w:t>
       </w:r>
+      <w:proofErr w:type="spellEnd"/>
       <w:r>
         <w:rPr>
           <w:rFonts w:ascii="Times New Roman" w:hAnsi="Times New Roman" w:cs="Times New Roman"/>
@@ -15807,7 +15891,27 @@
           <w:szCs w:val="24"/>
           <w:highlight w:val="yellow"/>
         </w:rPr>
-        <w:t>Hermano, hoy estoy en el poyo de la casa donde nos haces una falta sin fondo.</w:t>
+        <w:t xml:space="preserve">Hermano, hoy estoy en el </w:t>
+      </w:r>
+      <w:proofErr w:type="spellStart"/>
+      <w:r>
+        <w:rPr>
+          <w:rFonts w:ascii="Times New Roman" w:hAnsi="Times New Roman" w:cs="Times New Roman"/>
+          <w:sz w:val="24"/>
+          <w:szCs w:val="24"/>
+          <w:highlight w:val="yellow"/>
+        </w:rPr>
+        <w:t>poyo</w:t>
+      </w:r>
+      <w:proofErr w:type="spellEnd"/>
+      <w:r>
+        <w:rPr>
+          <w:rFonts w:ascii="Times New Roman" w:hAnsi="Times New Roman" w:cs="Times New Roman"/>
+          <w:sz w:val="24"/>
+          <w:szCs w:val="24"/>
+          <w:highlight w:val="yellow"/>
+        </w:rPr>
+        <w:t xml:space="preserve"> de la casa donde nos haces una falta sin fondo.</w:t>
       </w:r>
     </w:p>
     <w:p>
@@ -15938,8 +16042,19 @@
           <w:sz w:val="24"/>
           <w:szCs w:val="24"/>
         </w:rPr>
-        <w:t>formación perifásica</w:t>
-      </w:r>
+        <w:t xml:space="preserve">formación </w:t>
+      </w:r>
+      <w:proofErr w:type="spellStart"/>
+      <w:r>
+        <w:rPr>
+          <w:rFonts w:ascii="Times New Roman" w:hAnsi="Times New Roman" w:cs="Times New Roman"/>
+          <w:b/>
+          <w:sz w:val="24"/>
+          <w:szCs w:val="24"/>
+        </w:rPr>
+        <w:t>perifásica</w:t>
+      </w:r>
+      <w:proofErr w:type="spellEnd"/>
       <w:r>
         <w:rPr>
           <w:rFonts w:ascii="Times New Roman" w:hAnsi="Times New Roman" w:cs="Times New Roman"/>
@@ -17103,7 +17218,25 @@
           <w:sz w:val="24"/>
           <w:szCs w:val="24"/>
         </w:rPr>
-        <w:t xml:space="preserve"> de la comunicación, es el:</w:t>
+        <w:t xml:space="preserve"> de la </w:t>
+      </w:r>
+      <w:proofErr w:type="gramStart"/>
+      <w:r>
+        <w:rPr>
+          <w:rFonts w:ascii="Times New Roman" w:hAnsi="Times New Roman" w:cs="Times New Roman"/>
+          <w:sz w:val="24"/>
+          <w:szCs w:val="24"/>
+        </w:rPr>
+        <w:t>comunicación,</w:t>
+      </w:r>
+      <w:proofErr w:type="gramEnd"/>
+      <w:r>
+        <w:rPr>
+          <w:rFonts w:ascii="Times New Roman" w:hAnsi="Times New Roman" w:cs="Times New Roman"/>
+          <w:sz w:val="24"/>
+          <w:szCs w:val="24"/>
+        </w:rPr>
+        <w:t xml:space="preserve"> es el:</w:t>
       </w:r>
     </w:p>
     <w:p>
@@ -17338,13 +17471,23 @@
           <w:szCs w:val="24"/>
         </w:rPr>
       </w:pPr>
-      <w:r>
-        <w:rPr>
-          <w:rFonts w:ascii="Times New Roman" w:hAnsi="Times New Roman" w:cs="Times New Roman"/>
-          <w:sz w:val="24"/>
-          <w:szCs w:val="24"/>
-        </w:rPr>
-        <w:t>Comativa o apelativa</w:t>
+      <w:proofErr w:type="spellStart"/>
+      <w:r>
+        <w:rPr>
+          <w:rFonts w:ascii="Times New Roman" w:hAnsi="Times New Roman" w:cs="Times New Roman"/>
+          <w:sz w:val="24"/>
+          <w:szCs w:val="24"/>
+        </w:rPr>
+        <w:t>Comativa</w:t>
+      </w:r>
+      <w:proofErr w:type="spellEnd"/>
+      <w:r>
+        <w:rPr>
+          <w:rFonts w:ascii="Times New Roman" w:hAnsi="Times New Roman" w:cs="Times New Roman"/>
+          <w:sz w:val="24"/>
+          <w:szCs w:val="24"/>
+        </w:rPr>
+        <w:t xml:space="preserve"> o apelativa</w:t>
       </w:r>
     </w:p>
     <w:p>
@@ -17539,6 +17682,7 @@
           <w:szCs w:val="24"/>
         </w:rPr>
       </w:pPr>
+      <w:proofErr w:type="spellStart"/>
       <w:r>
         <w:rPr>
           <w:rFonts w:ascii="Times New Roman" w:hAnsi="Times New Roman" w:cs="Times New Roman"/>
@@ -17547,6 +17691,7 @@
         </w:rPr>
         <w:t>Diacromía</w:t>
       </w:r>
+      <w:proofErr w:type="spellEnd"/>
     </w:p>
     <w:p>
       <w:pPr>
@@ -17779,7 +17924,25 @@
           <w:sz w:val="24"/>
           <w:szCs w:val="24"/>
         </w:rPr>
-        <w:t>La primera unidad segmental de impulso fónico del habla real, corresponde a:</w:t>
+        <w:t xml:space="preserve">La primera unidad segmental de impulso fónico del habla </w:t>
+      </w:r>
+      <w:proofErr w:type="gramStart"/>
+      <w:r>
+        <w:rPr>
+          <w:rFonts w:ascii="Times New Roman" w:hAnsi="Times New Roman" w:cs="Times New Roman"/>
+          <w:sz w:val="24"/>
+          <w:szCs w:val="24"/>
+        </w:rPr>
+        <w:t>real,</w:t>
+      </w:r>
+      <w:proofErr w:type="gramEnd"/>
+      <w:r>
+        <w:rPr>
+          <w:rFonts w:ascii="Times New Roman" w:hAnsi="Times New Roman" w:cs="Times New Roman"/>
+          <w:sz w:val="24"/>
+          <w:szCs w:val="24"/>
+        </w:rPr>
+        <w:t xml:space="preserve"> corresponde a:</w:t>
       </w:r>
     </w:p>
     <w:p>
@@ -18089,7 +18252,43 @@
           <w:sz w:val="24"/>
           <w:szCs w:val="24"/>
         </w:rPr>
-        <w:t>Es la acentuación de palabras que cumplen distintas funciones dentro de una oración, y dicha  variación de funciones se distingue por la presencia o ausencia de tilde. Este concepto corresponde a la tildación …</w:t>
+        <w:t xml:space="preserve">Es la acentuación de palabras que cumplen distintas funciones dentro de una oración, y </w:t>
+      </w:r>
+      <w:proofErr w:type="gramStart"/>
+      <w:r>
+        <w:rPr>
+          <w:rFonts w:ascii="Times New Roman" w:hAnsi="Times New Roman" w:cs="Times New Roman"/>
+          <w:sz w:val="24"/>
+          <w:szCs w:val="24"/>
+        </w:rPr>
+        <w:t>dicha  variación</w:t>
+      </w:r>
+      <w:proofErr w:type="gramEnd"/>
+      <w:r>
+        <w:rPr>
+          <w:rFonts w:ascii="Times New Roman" w:hAnsi="Times New Roman" w:cs="Times New Roman"/>
+          <w:sz w:val="24"/>
+          <w:szCs w:val="24"/>
+        </w:rPr>
+        <w:t xml:space="preserve"> de funciones se distingue por la presencia o ausencia de tilde. Este concepto corresponde a la </w:t>
+      </w:r>
+      <w:proofErr w:type="spellStart"/>
+      <w:r>
+        <w:rPr>
+          <w:rFonts w:ascii="Times New Roman" w:hAnsi="Times New Roman" w:cs="Times New Roman"/>
+          <w:sz w:val="24"/>
+          <w:szCs w:val="24"/>
+        </w:rPr>
+        <w:t>tildación</w:t>
+      </w:r>
+      <w:proofErr w:type="spellEnd"/>
+      <w:r>
+        <w:rPr>
+          <w:rFonts w:ascii="Times New Roman" w:hAnsi="Times New Roman" w:cs="Times New Roman"/>
+          <w:sz w:val="24"/>
+          <w:szCs w:val="24"/>
+        </w:rPr>
+        <w:t xml:space="preserve"> …</w:t>
       </w:r>
     </w:p>
     <w:p>
@@ -18146,6 +18345,7 @@
           <w:szCs w:val="24"/>
         </w:rPr>
       </w:pPr>
+      <w:proofErr w:type="spellStart"/>
       <w:r>
         <w:rPr>
           <w:rFonts w:ascii="Times New Roman" w:hAnsi="Times New Roman" w:cs="Times New Roman"/>
@@ -18162,6 +18362,7 @@
         </w:rPr>
         <w:t>erética</w:t>
       </w:r>
+      <w:proofErr w:type="spellEnd"/>
     </w:p>
     <w:p>
       <w:pPr>
@@ -18198,6 +18399,7 @@
           <w:szCs w:val="24"/>
         </w:rPr>
       </w:pPr>
+      <w:proofErr w:type="spellStart"/>
       <w:r>
         <w:rPr>
           <w:rFonts w:ascii="Times New Roman" w:hAnsi="Times New Roman" w:cs="Times New Roman"/>
@@ -18206,6 +18408,7 @@
         </w:rPr>
         <w:t>rubórica</w:t>
       </w:r>
+      <w:proofErr w:type="spellEnd"/>
     </w:p>
     <w:p>
       <w:pPr>

</xml_diff>

<commit_message>
bugs casi todo corregido y listo para el ejecutable
</commit_message>
<xml_diff>
--- a/backend/uploads/examen_ordinario_I_UNAMBA_2023.docx
+++ b/backend/uploads/examen_ordinario_I_UNAMBA_2023.docx
@@ -1339,9 +1339,8 @@
           <w:sz w:val="24"/>
           <w:szCs w:val="24"/>
         </w:rPr>
-        <w:t xml:space="preserve">Lo que cobra y gasta diariamente un individuo suman S/.900.  Lo que gasta y cobra están en la relación de 2 a </w:t>
-      </w:r>
-      <w:proofErr w:type="gramStart"/>
+        <w:t>Lo que cobra y gasta diariamente un individuo suman S/.900.  Lo que gasta y cobra están en la relación de 2 a 3  ¿</w:t>
+      </w:r>
       <w:r>
         <w:rPr>
           <w:rFonts w:ascii="Times New Roman" w:hAnsi="Times New Roman" w:cs="Times New Roman"/>
@@ -1349,9 +1348,8 @@
           <w:sz w:val="24"/>
           <w:szCs w:val="24"/>
         </w:rPr>
-        <w:t>3  ¿</w:t>
-      </w:r>
-      <w:proofErr w:type="gramEnd"/>
+        <w:t>e</w:t>
+      </w:r>
       <w:r>
         <w:rPr>
           <w:rFonts w:ascii="Times New Roman" w:hAnsi="Times New Roman" w:cs="Times New Roman"/>
@@ -1359,7 +1357,7 @@
           <w:sz w:val="24"/>
           <w:szCs w:val="24"/>
         </w:rPr>
-        <w:t>e</w:t>
+        <w:t>n cuánto tiene que dis</w:t>
       </w:r>
       <w:r>
         <w:rPr>
@@ -1368,7 +1366,7 @@
           <w:sz w:val="24"/>
           <w:szCs w:val="24"/>
         </w:rPr>
-        <w:t>n cuánto tiene que dis</w:t>
+        <w:t>minuir</w:t>
       </w:r>
       <w:r>
         <w:rPr>
@@ -1377,16 +1375,33 @@
           <w:sz w:val="24"/>
           <w:szCs w:val="24"/>
         </w:rPr>
-        <w:t>minuir</w:t>
-      </w:r>
-      <w:r>
+        <w:t xml:space="preserve"> el gasto diario para que dicha relación sea 3 a 5?</w:t>
+      </w:r>
+    </w:p>
+    <w:p>
+      <w:pPr>
+        <w:pStyle w:val="Prrafodelista"/>
+        <w:numPr>
+          <w:ilvl w:val="0"/>
+          <w:numId w:val="10"/>
+        </w:numPr>
         <w:rPr>
           <w:rFonts w:ascii="Times New Roman" w:hAnsi="Times New Roman" w:cs="Times New Roman"/>
           <w:color w:val="0D0D0D" w:themeColor="text1" w:themeTint="F2"/>
           <w:sz w:val="24"/>
           <w:szCs w:val="24"/>
-        </w:rPr>
-        <w:t xml:space="preserve"> el gasto diario para que dicha relación sea 3 a 5?</w:t>
+          <w:highlight w:val="yellow"/>
+        </w:rPr>
+      </w:pPr>
+      <w:r>
+        <w:rPr>
+          <w:rFonts w:ascii="Times New Roman" w:hAnsi="Times New Roman" w:cs="Times New Roman"/>
+          <w:color w:val="0D0D0D" w:themeColor="text1" w:themeTint="F2"/>
+          <w:sz w:val="24"/>
+          <w:szCs w:val="24"/>
+          <w:highlight w:val="yellow"/>
+        </w:rPr>
+        <w:t>36</w:t>
       </w:r>
     </w:p>
     <w:p>
@@ -1401,7 +1416,6 @@
           <w:color w:val="0D0D0D" w:themeColor="text1" w:themeTint="F2"/>
           <w:sz w:val="24"/>
           <w:szCs w:val="24"/>
-          <w:highlight w:val="yellow"/>
         </w:rPr>
       </w:pPr>
       <w:r>
@@ -1410,10 +1424,42 @@
           <w:color w:val="0D0D0D" w:themeColor="text1" w:themeTint="F2"/>
           <w:sz w:val="24"/>
           <w:szCs w:val="24"/>
-          <w:highlight w:val="yellow"/>
+        </w:rPr>
+        <w:t>40</w:t>
+      </w:r>
+    </w:p>
+    <w:p>
+      <w:pPr>
+        <w:pStyle w:val="Prrafodelista"/>
+        <w:numPr>
+          <w:ilvl w:val="0"/>
+          <w:numId w:val="10"/>
+        </w:numPr>
+        <w:rPr>
+          <w:rFonts w:ascii="Times New Roman" w:hAnsi="Times New Roman" w:cs="Times New Roman"/>
+          <w:color w:val="0D0D0D" w:themeColor="text1" w:themeTint="F2"/>
+          <w:sz w:val="24"/>
+          <w:szCs w:val="24"/>
+        </w:rPr>
+      </w:pPr>
+      <w:r>
+        <w:rPr>
+          <w:rFonts w:ascii="Times New Roman" w:hAnsi="Times New Roman" w:cs="Times New Roman"/>
+          <w:color w:val="0D0D0D" w:themeColor="text1" w:themeTint="F2"/>
+          <w:sz w:val="24"/>
+          <w:szCs w:val="24"/>
         </w:rPr>
         <w:t>36</w:t>
       </w:r>
+      <w:r>
+        <w:rPr>
+          <w:rFonts w:ascii="Times New Roman" w:hAnsi="Times New Roman" w:cs="Times New Roman"/>
+          <w:color w:val="0D0D0D" w:themeColor="text1" w:themeTint="F2"/>
+          <w:sz w:val="24"/>
+          <w:szCs w:val="24"/>
+        </w:rPr>
+        <w:t>0</w:t>
+      </w:r>
     </w:p>
     <w:p>
       <w:pPr>
@@ -1436,7 +1482,7 @@
           <w:sz w:val="24"/>
           <w:szCs w:val="24"/>
         </w:rPr>
-        <w:t>40</w:t>
+        <w:t>560</w:t>
       </w:r>
     </w:p>
     <w:p>
@@ -1460,25 +1506,29 @@
           <w:sz w:val="24"/>
           <w:szCs w:val="24"/>
         </w:rPr>
-        <w:t>36</w:t>
-      </w:r>
-      <w:r>
+        <w:t>400</w:t>
+      </w:r>
+    </w:p>
+    <w:p>
+      <w:pPr>
+        <w:pStyle w:val="Prrafodelista"/>
+        <w:ind w:left="1080"/>
         <w:rPr>
           <w:rFonts w:ascii="Times New Roman" w:hAnsi="Times New Roman" w:cs="Times New Roman"/>
           <w:color w:val="0D0D0D" w:themeColor="text1" w:themeTint="F2"/>
           <w:sz w:val="24"/>
           <w:szCs w:val="24"/>
         </w:rPr>
-        <w:t>0</w:t>
-      </w:r>
-    </w:p>
-    <w:p>
-      <w:pPr>
-        <w:pStyle w:val="Prrafodelista"/>
-        <w:numPr>
-          <w:ilvl w:val="0"/>
-          <w:numId w:val="10"/>
-        </w:numPr>
+      </w:pPr>
+    </w:p>
+    <w:p>
+      <w:pPr>
+        <w:pStyle w:val="Prrafodelista"/>
+        <w:numPr>
+          <w:ilvl w:val="0"/>
+          <w:numId w:val="1"/>
+        </w:numPr>
+        <w:jc w:val="both"/>
         <w:rPr>
           <w:rFonts w:ascii="Times New Roman" w:hAnsi="Times New Roman" w:cs="Times New Roman"/>
           <w:color w:val="0D0D0D" w:themeColor="text1" w:themeTint="F2"/>
@@ -1493,23 +1543,17 @@
           <w:sz w:val="24"/>
           <w:szCs w:val="24"/>
         </w:rPr>
-        <w:t>560</w:t>
-      </w:r>
-    </w:p>
-    <w:p>
-      <w:pPr>
-        <w:pStyle w:val="Prrafodelista"/>
-        <w:numPr>
-          <w:ilvl w:val="0"/>
-          <w:numId w:val="10"/>
-        </w:numPr>
+        <w:t>Un superpanetón en forma de paralele</w:t>
+      </w:r>
+      <w:r>
         <w:rPr>
           <w:rFonts w:ascii="Times New Roman" w:hAnsi="Times New Roman" w:cs="Times New Roman"/>
           <w:color w:val="0D0D0D" w:themeColor="text1" w:themeTint="F2"/>
           <w:sz w:val="24"/>
           <w:szCs w:val="24"/>
         </w:rPr>
-      </w:pPr>
+        <w:t>p</w:t>
+      </w:r>
       <w:r>
         <w:rPr>
           <w:rFonts w:ascii="Times New Roman" w:hAnsi="Times New Roman" w:cs="Times New Roman"/>
@@ -1517,36 +1561,26 @@
           <w:sz w:val="24"/>
           <w:szCs w:val="24"/>
         </w:rPr>
-        <w:t>400</w:t>
-      </w:r>
-    </w:p>
-    <w:p>
-      <w:pPr>
-        <w:pStyle w:val="Prrafodelista"/>
-        <w:ind w:left="1080"/>
+        <w:t>ípedo t</w:t>
+      </w:r>
+      <w:r>
         <w:rPr>
           <w:rFonts w:ascii="Times New Roman" w:hAnsi="Times New Roman" w:cs="Times New Roman"/>
           <w:color w:val="0D0D0D" w:themeColor="text1" w:themeTint="F2"/>
           <w:sz w:val="24"/>
           <w:szCs w:val="24"/>
         </w:rPr>
-      </w:pPr>
-    </w:p>
-    <w:p>
-      <w:pPr>
-        <w:pStyle w:val="Prrafodelista"/>
-        <w:numPr>
-          <w:ilvl w:val="0"/>
-          <w:numId w:val="1"/>
-        </w:numPr>
-        <w:jc w:val="both"/>
+        <w:t>i</w:t>
+      </w:r>
+      <w:r>
         <w:rPr>
           <w:rFonts w:ascii="Times New Roman" w:hAnsi="Times New Roman" w:cs="Times New Roman"/>
           <w:color w:val="0D0D0D" w:themeColor="text1" w:themeTint="F2"/>
           <w:sz w:val="24"/>
           <w:szCs w:val="24"/>
         </w:rPr>
-      </w:pPr>
+        <w:t>ene un volumen de 2</w:t>
+      </w:r>
       <w:r>
         <w:rPr>
           <w:rFonts w:ascii="Times New Roman" w:hAnsi="Times New Roman" w:cs="Times New Roman"/>
@@ -1554,9 +1588,8 @@
           <w:sz w:val="24"/>
           <w:szCs w:val="24"/>
         </w:rPr>
-        <w:t xml:space="preserve">Un </w:t>
-      </w:r>
-      <w:proofErr w:type="spellStart"/>
+        <w:t xml:space="preserve"> </w:t>
+      </w:r>
       <w:r>
         <w:rPr>
           <w:rFonts w:ascii="Times New Roman" w:hAnsi="Times New Roman" w:cs="Times New Roman"/>
@@ -1564,17 +1597,17 @@
           <w:sz w:val="24"/>
           <w:szCs w:val="24"/>
         </w:rPr>
-        <w:t>superpanetón</w:t>
-      </w:r>
-      <w:proofErr w:type="spellEnd"/>
+        <w:t>160 cm</w:t>
+      </w:r>
       <w:r>
         <w:rPr>
           <w:rFonts w:ascii="Times New Roman" w:hAnsi="Times New Roman" w:cs="Times New Roman"/>
           <w:color w:val="0D0D0D" w:themeColor="text1" w:themeTint="F2"/>
           <w:sz w:val="24"/>
           <w:szCs w:val="24"/>
-        </w:rPr>
-        <w:t xml:space="preserve"> en forma de paralele</w:t>
+          <w:vertAlign w:val="superscript"/>
+        </w:rPr>
+        <w:t>3</w:t>
       </w:r>
       <w:r>
         <w:rPr>
@@ -1583,91 +1616,7 @@
           <w:sz w:val="24"/>
           <w:szCs w:val="24"/>
         </w:rPr>
-        <w:t>p</w:t>
-      </w:r>
-      <w:r>
-        <w:rPr>
-          <w:rFonts w:ascii="Times New Roman" w:hAnsi="Times New Roman" w:cs="Times New Roman"/>
-          <w:color w:val="0D0D0D" w:themeColor="text1" w:themeTint="F2"/>
-          <w:sz w:val="24"/>
-          <w:szCs w:val="24"/>
-        </w:rPr>
-        <w:t>ípedo t</w:t>
-      </w:r>
-      <w:r>
-        <w:rPr>
-          <w:rFonts w:ascii="Times New Roman" w:hAnsi="Times New Roman" w:cs="Times New Roman"/>
-          <w:color w:val="0D0D0D" w:themeColor="text1" w:themeTint="F2"/>
-          <w:sz w:val="24"/>
-          <w:szCs w:val="24"/>
-        </w:rPr>
-        <w:t>i</w:t>
-      </w:r>
-      <w:r>
-        <w:rPr>
-          <w:rFonts w:ascii="Times New Roman" w:hAnsi="Times New Roman" w:cs="Times New Roman"/>
-          <w:color w:val="0D0D0D" w:themeColor="text1" w:themeTint="F2"/>
-          <w:sz w:val="24"/>
-          <w:szCs w:val="24"/>
-        </w:rPr>
-        <w:t>ene un volumen de 2</w:t>
-      </w:r>
-      <w:r>
-        <w:rPr>
-          <w:rFonts w:ascii="Times New Roman" w:hAnsi="Times New Roman" w:cs="Times New Roman"/>
-          <w:color w:val="0D0D0D" w:themeColor="text1" w:themeTint="F2"/>
-          <w:sz w:val="24"/>
-          <w:szCs w:val="24"/>
-        </w:rPr>
-        <w:t xml:space="preserve"> </w:t>
-      </w:r>
-      <w:r>
-        <w:rPr>
-          <w:rFonts w:ascii="Times New Roman" w:hAnsi="Times New Roman" w:cs="Times New Roman"/>
-          <w:color w:val="0D0D0D" w:themeColor="text1" w:themeTint="F2"/>
-          <w:sz w:val="24"/>
-          <w:szCs w:val="24"/>
-        </w:rPr>
-        <w:t>160 cm</w:t>
-      </w:r>
-      <w:r>
-        <w:rPr>
-          <w:rFonts w:ascii="Times New Roman" w:hAnsi="Times New Roman" w:cs="Times New Roman"/>
-          <w:color w:val="0D0D0D" w:themeColor="text1" w:themeTint="F2"/>
-          <w:sz w:val="24"/>
-          <w:szCs w:val="24"/>
-          <w:vertAlign w:val="superscript"/>
-        </w:rPr>
-        <w:t>3</w:t>
-      </w:r>
-      <w:r>
-        <w:rPr>
-          <w:rFonts w:ascii="Times New Roman" w:hAnsi="Times New Roman" w:cs="Times New Roman"/>
-          <w:color w:val="0D0D0D" w:themeColor="text1" w:themeTint="F2"/>
-          <w:sz w:val="24"/>
-          <w:szCs w:val="24"/>
-        </w:rPr>
-        <w:t xml:space="preserve">. El volumen de un </w:t>
-      </w:r>
-      <w:proofErr w:type="spellStart"/>
-      <w:r>
-        <w:rPr>
-          <w:rFonts w:ascii="Times New Roman" w:hAnsi="Times New Roman" w:cs="Times New Roman"/>
-          <w:color w:val="0D0D0D" w:themeColor="text1" w:themeTint="F2"/>
-          <w:sz w:val="24"/>
-          <w:szCs w:val="24"/>
-        </w:rPr>
-        <w:t>minipanetón</w:t>
-      </w:r>
-      <w:proofErr w:type="spellEnd"/>
-      <w:r>
-        <w:rPr>
-          <w:rFonts w:ascii="Times New Roman" w:hAnsi="Times New Roman" w:cs="Times New Roman"/>
-          <w:color w:val="0D0D0D" w:themeColor="text1" w:themeTint="F2"/>
-          <w:sz w:val="24"/>
-          <w:szCs w:val="24"/>
-        </w:rPr>
-        <w:t xml:space="preserve"> de igual forma, pero con dimensiones reducidas a</w:t>
+        <w:t>. El volumen de un minipanetón de igual forma, pero con dimensiones reducidas a</w:t>
       </w:r>
       <w:r>
         <w:rPr>
@@ -2467,27 +2416,7 @@
           <w:sz w:val="24"/>
           <w:szCs w:val="24"/>
         </w:rPr>
-        <w:t xml:space="preserve">Tenía 40 cuadernos.  A mi amigo Julio le </w:t>
-      </w:r>
-      <w:proofErr w:type="spellStart"/>
-      <w:r>
-        <w:rPr>
-          <w:rFonts w:ascii="Times New Roman" w:hAnsi="Times New Roman" w:cs="Times New Roman"/>
-          <w:color w:val="0D0D0D" w:themeColor="text1" w:themeTint="F2"/>
-          <w:sz w:val="24"/>
-          <w:szCs w:val="24"/>
-        </w:rPr>
-        <w:t>dí</w:t>
-      </w:r>
-      <w:proofErr w:type="spellEnd"/>
-      <w:r>
-        <w:rPr>
-          <w:rFonts w:ascii="Times New Roman" w:hAnsi="Times New Roman" w:cs="Times New Roman"/>
-          <w:color w:val="0D0D0D" w:themeColor="text1" w:themeTint="F2"/>
-          <w:sz w:val="24"/>
-          <w:szCs w:val="24"/>
-        </w:rPr>
-        <w:t xml:space="preserve"> 20%, a mi primo Pedro el 30% y a m</w:t>
+        <w:t>Tenía 40 cuadernos.  A mi amigo Julio le dí 20%, a mi primo Pedro el 30% y a m</w:t>
       </w:r>
       <w:r>
         <w:rPr>
@@ -5218,7 +5147,7 @@
           <w:lang w:eastAsia="es-PE"/>
         </w:rPr>
         <w:drawing>
-          <wp:anchor distT="0" distB="0" distL="114300" distR="114300" simplePos="0" relativeHeight="251661312" behindDoc="0" locked="0" layoutInCell="1" allowOverlap="1" wp14:anchorId="666557DC" wp14:editId="06D447E0">
+          <wp:anchor distT="0" distB="0" distL="114300" distR="114300" simplePos="0" relativeHeight="251661312" behindDoc="0" locked="0" layoutInCell="1" allowOverlap="1" wp14:anchorId="666557DC" wp14:editId="58E870CE">
             <wp:simplePos x="0" y="0"/>
             <wp:positionH relativeFrom="column">
               <wp:posOffset>2148866</wp:posOffset>
@@ -15180,16 +15109,14 @@
           <w:szCs w:val="24"/>
         </w:rPr>
       </w:pPr>
-      <w:proofErr w:type="spellStart"/>
-      <w:r>
-        <w:rPr>
-          <w:rFonts w:ascii="Times New Roman" w:hAnsi="Times New Roman" w:cs="Times New Roman"/>
-          <w:sz w:val="24"/>
-          <w:szCs w:val="24"/>
-        </w:rPr>
-        <w:t>ó</w:t>
-      </w:r>
-      <w:proofErr w:type="spellEnd"/>
+      <w:r>
+        <w:rPr>
+          <w:rFonts w:ascii="Times New Roman" w:hAnsi="Times New Roman" w:cs="Times New Roman"/>
+          <w:sz w:val="24"/>
+          <w:szCs w:val="24"/>
+        </w:rPr>
+        <w:t>5</w:t>
+      </w:r>
     </w:p>
     <w:p>
       <w:pPr>
@@ -15829,9 +15756,8 @@
           <w:sz w:val="24"/>
           <w:szCs w:val="24"/>
         </w:rPr>
-        <w:t xml:space="preserve">coma </w:t>
-      </w:r>
-      <w:proofErr w:type="spellStart"/>
+        <w:t>coma vocativ</w:t>
+      </w:r>
       <w:r>
         <w:rPr>
           <w:rFonts w:ascii="Times New Roman" w:hAnsi="Times New Roman" w:cs="Times New Roman"/>
@@ -15839,7 +15765,171 @@
           <w:sz w:val="24"/>
           <w:szCs w:val="24"/>
         </w:rPr>
-        <w:t>vocativ</w:t>
+        <w:t>a</w:t>
+      </w:r>
+      <w:r>
+        <w:rPr>
+          <w:rFonts w:ascii="Times New Roman" w:hAnsi="Times New Roman" w:cs="Times New Roman"/>
+          <w:sz w:val="24"/>
+          <w:szCs w:val="24"/>
+        </w:rPr>
+        <w:t>?</w:t>
+      </w:r>
+    </w:p>
+    <w:p>
+      <w:pPr>
+        <w:pStyle w:val="Prrafodelista"/>
+        <w:rPr>
+          <w:rFonts w:ascii="Times New Roman" w:hAnsi="Times New Roman" w:cs="Times New Roman"/>
+          <w:sz w:val="24"/>
+          <w:szCs w:val="24"/>
+        </w:rPr>
+      </w:pPr>
+    </w:p>
+    <w:p>
+      <w:pPr>
+        <w:pStyle w:val="Prrafodelista"/>
+        <w:numPr>
+          <w:ilvl w:val="0"/>
+          <w:numId w:val="59"/>
+        </w:numPr>
+        <w:rPr>
+          <w:rFonts w:ascii="Times New Roman" w:hAnsi="Times New Roman" w:cs="Times New Roman"/>
+          <w:sz w:val="24"/>
+          <w:szCs w:val="24"/>
+          <w:highlight w:val="yellow"/>
+        </w:rPr>
+      </w:pPr>
+      <w:r>
+        <w:rPr>
+          <w:rFonts w:ascii="Times New Roman" w:hAnsi="Times New Roman" w:cs="Times New Roman"/>
+          <w:sz w:val="24"/>
+          <w:szCs w:val="24"/>
+          <w:highlight w:val="yellow"/>
+        </w:rPr>
+        <w:t>Hermano, hoy estoy en el poyo de la casa donde nos haces una falta sin fondo.</w:t>
+      </w:r>
+    </w:p>
+    <w:p>
+      <w:pPr>
+        <w:pStyle w:val="Prrafodelista"/>
+        <w:numPr>
+          <w:ilvl w:val="0"/>
+          <w:numId w:val="59"/>
+        </w:numPr>
+        <w:rPr>
+          <w:rFonts w:ascii="Times New Roman" w:hAnsi="Times New Roman" w:cs="Times New Roman"/>
+          <w:sz w:val="24"/>
+          <w:szCs w:val="24"/>
+        </w:rPr>
+      </w:pPr>
+      <w:r>
+        <w:rPr>
+          <w:rFonts w:ascii="Times New Roman" w:hAnsi="Times New Roman" w:cs="Times New Roman"/>
+          <w:sz w:val="24"/>
+          <w:szCs w:val="24"/>
+        </w:rPr>
+        <w:t>Querrán descuartizarlo, triturarlo, mancharlo, pisotearlo, desalmarlo.</w:t>
+      </w:r>
+    </w:p>
+    <w:p>
+      <w:pPr>
+        <w:pStyle w:val="Prrafodelista"/>
+        <w:numPr>
+          <w:ilvl w:val="0"/>
+          <w:numId w:val="59"/>
+        </w:numPr>
+        <w:rPr>
+          <w:rFonts w:ascii="Times New Roman" w:hAnsi="Times New Roman" w:cs="Times New Roman"/>
+          <w:sz w:val="24"/>
+          <w:szCs w:val="24"/>
+        </w:rPr>
+      </w:pPr>
+      <w:r>
+        <w:rPr>
+          <w:rFonts w:ascii="Times New Roman" w:hAnsi="Times New Roman" w:cs="Times New Roman"/>
+          <w:sz w:val="24"/>
+          <w:szCs w:val="24"/>
+        </w:rPr>
+        <w:t>¿Motivos del cese? En el primer caso, mala comida. En el segundo, el hijo mayor. En el tercero, trabaja de mula.</w:t>
+      </w:r>
+    </w:p>
+    <w:p>
+      <w:pPr>
+        <w:pStyle w:val="Prrafodelista"/>
+        <w:numPr>
+          <w:ilvl w:val="0"/>
+          <w:numId w:val="59"/>
+        </w:numPr>
+        <w:rPr>
+          <w:rFonts w:ascii="Times New Roman" w:hAnsi="Times New Roman" w:cs="Times New Roman"/>
+          <w:sz w:val="24"/>
+          <w:szCs w:val="24"/>
+        </w:rPr>
+      </w:pPr>
+      <w:r>
+        <w:rPr>
+          <w:rFonts w:ascii="Times New Roman" w:hAnsi="Times New Roman" w:cs="Times New Roman"/>
+          <w:sz w:val="24"/>
+          <w:szCs w:val="24"/>
+        </w:rPr>
+        <w:t>Después de la clase, iremos a la biblioteca.</w:t>
+      </w:r>
+    </w:p>
+    <w:p>
+      <w:pPr>
+        <w:pStyle w:val="Prrafodelista"/>
+        <w:numPr>
+          <w:ilvl w:val="0"/>
+          <w:numId w:val="59"/>
+        </w:numPr>
+        <w:rPr>
+          <w:rFonts w:ascii="Times New Roman" w:hAnsi="Times New Roman" w:cs="Times New Roman"/>
+          <w:sz w:val="24"/>
+          <w:szCs w:val="24"/>
+        </w:rPr>
+      </w:pPr>
+      <w:r>
+        <w:rPr>
+          <w:rFonts w:ascii="Times New Roman" w:hAnsi="Times New Roman" w:cs="Times New Roman"/>
+          <w:sz w:val="24"/>
+          <w:szCs w:val="24"/>
+        </w:rPr>
+        <w:t>El problema de la educación es grave, es decir, más de lo que pensamos.</w:t>
+      </w:r>
+    </w:p>
+    <w:p>
+      <w:pPr>
+        <w:pStyle w:val="Prrafodelista"/>
+        <w:ind w:left="1080"/>
+        <w:rPr>
+          <w:rFonts w:ascii="Times New Roman" w:hAnsi="Times New Roman" w:cs="Times New Roman"/>
+          <w:sz w:val="24"/>
+          <w:szCs w:val="24"/>
+        </w:rPr>
+      </w:pPr>
+    </w:p>
+    <w:p>
+      <w:pPr>
+        <w:pStyle w:val="Prrafodelista"/>
+        <w:numPr>
+          <w:ilvl w:val="0"/>
+          <w:numId w:val="1"/>
+        </w:numPr>
+        <w:jc w:val="both"/>
+        <w:rPr>
+          <w:rFonts w:ascii="Times New Roman" w:hAnsi="Times New Roman" w:cs="Times New Roman"/>
+          <w:sz w:val="24"/>
+          <w:szCs w:val="24"/>
+        </w:rPr>
+      </w:pPr>
+      <w:r>
+        <w:rPr>
+          <w:rFonts w:ascii="Times New Roman" w:hAnsi="Times New Roman" w:cs="Times New Roman"/>
+          <w:sz w:val="24"/>
+          <w:szCs w:val="24"/>
+        </w:rPr>
+        <w:t xml:space="preserve">Reconozca la oración en la que se observe un adjetivo con </w:t>
       </w:r>
       <w:r>
         <w:rPr>
@@ -15848,213 +15938,8 @@
           <w:sz w:val="24"/>
           <w:szCs w:val="24"/>
         </w:rPr>
-        <w:t>a</w:t>
-      </w:r>
-      <w:proofErr w:type="spellEnd"/>
-      <w:r>
-        <w:rPr>
-          <w:rFonts w:ascii="Times New Roman" w:hAnsi="Times New Roman" w:cs="Times New Roman"/>
-          <w:sz w:val="24"/>
-          <w:szCs w:val="24"/>
-        </w:rPr>
-        <w:t>?</w:t>
-      </w:r>
-    </w:p>
-    <w:p>
-      <w:pPr>
-        <w:pStyle w:val="Prrafodelista"/>
-        <w:rPr>
-          <w:rFonts w:ascii="Times New Roman" w:hAnsi="Times New Roman" w:cs="Times New Roman"/>
-          <w:sz w:val="24"/>
-          <w:szCs w:val="24"/>
-        </w:rPr>
-      </w:pPr>
-    </w:p>
-    <w:p>
-      <w:pPr>
-        <w:pStyle w:val="Prrafodelista"/>
-        <w:numPr>
-          <w:ilvl w:val="0"/>
-          <w:numId w:val="59"/>
-        </w:numPr>
-        <w:rPr>
-          <w:rFonts w:ascii="Times New Roman" w:hAnsi="Times New Roman" w:cs="Times New Roman"/>
-          <w:sz w:val="24"/>
-          <w:szCs w:val="24"/>
-          <w:highlight w:val="yellow"/>
-        </w:rPr>
-      </w:pPr>
-      <w:r>
-        <w:rPr>
-          <w:rFonts w:ascii="Times New Roman" w:hAnsi="Times New Roman" w:cs="Times New Roman"/>
-          <w:sz w:val="24"/>
-          <w:szCs w:val="24"/>
-          <w:highlight w:val="yellow"/>
-        </w:rPr>
-        <w:t xml:space="preserve">Hermano, hoy estoy en el </w:t>
-      </w:r>
-      <w:proofErr w:type="spellStart"/>
-      <w:r>
-        <w:rPr>
-          <w:rFonts w:ascii="Times New Roman" w:hAnsi="Times New Roman" w:cs="Times New Roman"/>
-          <w:sz w:val="24"/>
-          <w:szCs w:val="24"/>
-          <w:highlight w:val="yellow"/>
-        </w:rPr>
-        <w:t>poyo</w:t>
-      </w:r>
-      <w:proofErr w:type="spellEnd"/>
-      <w:r>
-        <w:rPr>
-          <w:rFonts w:ascii="Times New Roman" w:hAnsi="Times New Roman" w:cs="Times New Roman"/>
-          <w:sz w:val="24"/>
-          <w:szCs w:val="24"/>
-          <w:highlight w:val="yellow"/>
-        </w:rPr>
-        <w:t xml:space="preserve"> de la casa donde nos haces una falta sin fondo.</w:t>
-      </w:r>
-    </w:p>
-    <w:p>
-      <w:pPr>
-        <w:pStyle w:val="Prrafodelista"/>
-        <w:numPr>
-          <w:ilvl w:val="0"/>
-          <w:numId w:val="59"/>
-        </w:numPr>
-        <w:rPr>
-          <w:rFonts w:ascii="Times New Roman" w:hAnsi="Times New Roman" w:cs="Times New Roman"/>
-          <w:sz w:val="24"/>
-          <w:szCs w:val="24"/>
-        </w:rPr>
-      </w:pPr>
-      <w:r>
-        <w:rPr>
-          <w:rFonts w:ascii="Times New Roman" w:hAnsi="Times New Roman" w:cs="Times New Roman"/>
-          <w:sz w:val="24"/>
-          <w:szCs w:val="24"/>
-        </w:rPr>
-        <w:t>Querrán descuartizarlo, triturarlo, mancharlo, pisotearlo, desalmarlo.</w:t>
-      </w:r>
-    </w:p>
-    <w:p>
-      <w:pPr>
-        <w:pStyle w:val="Prrafodelista"/>
-        <w:numPr>
-          <w:ilvl w:val="0"/>
-          <w:numId w:val="59"/>
-        </w:numPr>
-        <w:rPr>
-          <w:rFonts w:ascii="Times New Roman" w:hAnsi="Times New Roman" w:cs="Times New Roman"/>
-          <w:sz w:val="24"/>
-          <w:szCs w:val="24"/>
-        </w:rPr>
-      </w:pPr>
-      <w:r>
-        <w:rPr>
-          <w:rFonts w:ascii="Times New Roman" w:hAnsi="Times New Roman" w:cs="Times New Roman"/>
-          <w:sz w:val="24"/>
-          <w:szCs w:val="24"/>
-        </w:rPr>
-        <w:t>¿Motivos del cese? En el primer caso, mala comida. En el segundo, el hijo mayor. En el tercero, trabaja de mula.</w:t>
-      </w:r>
-    </w:p>
-    <w:p>
-      <w:pPr>
-        <w:pStyle w:val="Prrafodelista"/>
-        <w:numPr>
-          <w:ilvl w:val="0"/>
-          <w:numId w:val="59"/>
-        </w:numPr>
-        <w:rPr>
-          <w:rFonts w:ascii="Times New Roman" w:hAnsi="Times New Roman" w:cs="Times New Roman"/>
-          <w:sz w:val="24"/>
-          <w:szCs w:val="24"/>
-        </w:rPr>
-      </w:pPr>
-      <w:r>
-        <w:rPr>
-          <w:rFonts w:ascii="Times New Roman" w:hAnsi="Times New Roman" w:cs="Times New Roman"/>
-          <w:sz w:val="24"/>
-          <w:szCs w:val="24"/>
-        </w:rPr>
-        <w:t>Después de la clase, iremos a la biblioteca.</w:t>
-      </w:r>
-    </w:p>
-    <w:p>
-      <w:pPr>
-        <w:pStyle w:val="Prrafodelista"/>
-        <w:numPr>
-          <w:ilvl w:val="0"/>
-          <w:numId w:val="59"/>
-        </w:numPr>
-        <w:rPr>
-          <w:rFonts w:ascii="Times New Roman" w:hAnsi="Times New Roman" w:cs="Times New Roman"/>
-          <w:sz w:val="24"/>
-          <w:szCs w:val="24"/>
-        </w:rPr>
-      </w:pPr>
-      <w:r>
-        <w:rPr>
-          <w:rFonts w:ascii="Times New Roman" w:hAnsi="Times New Roman" w:cs="Times New Roman"/>
-          <w:sz w:val="24"/>
-          <w:szCs w:val="24"/>
-        </w:rPr>
-        <w:t>El problema de la educación es grave, es decir, más de lo que pensamos.</w:t>
-      </w:r>
-    </w:p>
-    <w:p>
-      <w:pPr>
-        <w:pStyle w:val="Prrafodelista"/>
-        <w:ind w:left="1080"/>
-        <w:rPr>
-          <w:rFonts w:ascii="Times New Roman" w:hAnsi="Times New Roman" w:cs="Times New Roman"/>
-          <w:sz w:val="24"/>
-          <w:szCs w:val="24"/>
-        </w:rPr>
-      </w:pPr>
-    </w:p>
-    <w:p>
-      <w:pPr>
-        <w:pStyle w:val="Prrafodelista"/>
-        <w:numPr>
-          <w:ilvl w:val="0"/>
-          <w:numId w:val="1"/>
-        </w:numPr>
-        <w:jc w:val="both"/>
-        <w:rPr>
-          <w:rFonts w:ascii="Times New Roman" w:hAnsi="Times New Roman" w:cs="Times New Roman"/>
-          <w:sz w:val="24"/>
-          <w:szCs w:val="24"/>
-        </w:rPr>
-      </w:pPr>
-      <w:r>
-        <w:rPr>
-          <w:rFonts w:ascii="Times New Roman" w:hAnsi="Times New Roman" w:cs="Times New Roman"/>
-          <w:sz w:val="24"/>
-          <w:szCs w:val="24"/>
-        </w:rPr>
-        <w:t xml:space="preserve">Reconozca la oración en la que se observe un adjetivo con </w:t>
-      </w:r>
-      <w:r>
-        <w:rPr>
-          <w:rFonts w:ascii="Times New Roman" w:hAnsi="Times New Roman" w:cs="Times New Roman"/>
-          <w:b/>
-          <w:sz w:val="24"/>
-          <w:szCs w:val="24"/>
-        </w:rPr>
-        <w:t xml:space="preserve">formación </w:t>
-      </w:r>
-      <w:proofErr w:type="spellStart"/>
-      <w:r>
-        <w:rPr>
-          <w:rFonts w:ascii="Times New Roman" w:hAnsi="Times New Roman" w:cs="Times New Roman"/>
-          <w:b/>
-          <w:sz w:val="24"/>
-          <w:szCs w:val="24"/>
-        </w:rPr>
-        <w:t>perifásica</w:t>
-      </w:r>
-      <w:proofErr w:type="spellEnd"/>
+        <w:t>formación perifásica</w:t>
+      </w:r>
       <w:r>
         <w:rPr>
           <w:rFonts w:ascii="Times New Roman" w:hAnsi="Times New Roman" w:cs="Times New Roman"/>
@@ -17218,25 +17103,7 @@
           <w:sz w:val="24"/>
           <w:szCs w:val="24"/>
         </w:rPr>
-        <w:t xml:space="preserve"> de la </w:t>
-      </w:r>
-      <w:proofErr w:type="gramStart"/>
-      <w:r>
-        <w:rPr>
-          <w:rFonts w:ascii="Times New Roman" w:hAnsi="Times New Roman" w:cs="Times New Roman"/>
-          <w:sz w:val="24"/>
-          <w:szCs w:val="24"/>
-        </w:rPr>
-        <w:t>comunicación,</w:t>
-      </w:r>
-      <w:proofErr w:type="gramEnd"/>
-      <w:r>
-        <w:rPr>
-          <w:rFonts w:ascii="Times New Roman" w:hAnsi="Times New Roman" w:cs="Times New Roman"/>
-          <w:sz w:val="24"/>
-          <w:szCs w:val="24"/>
-        </w:rPr>
-        <w:t xml:space="preserve"> es el:</w:t>
+        <w:t xml:space="preserve"> de la comunicación, es el:</w:t>
       </w:r>
     </w:p>
     <w:p>
@@ -17471,23 +17338,13 @@
           <w:szCs w:val="24"/>
         </w:rPr>
       </w:pPr>
-      <w:proofErr w:type="spellStart"/>
-      <w:r>
-        <w:rPr>
-          <w:rFonts w:ascii="Times New Roman" w:hAnsi="Times New Roman" w:cs="Times New Roman"/>
-          <w:sz w:val="24"/>
-          <w:szCs w:val="24"/>
-        </w:rPr>
-        <w:t>Comativa</w:t>
-      </w:r>
-      <w:proofErr w:type="spellEnd"/>
-      <w:r>
-        <w:rPr>
-          <w:rFonts w:ascii="Times New Roman" w:hAnsi="Times New Roman" w:cs="Times New Roman"/>
-          <w:sz w:val="24"/>
-          <w:szCs w:val="24"/>
-        </w:rPr>
-        <w:t xml:space="preserve"> o apelativa</w:t>
+      <w:r>
+        <w:rPr>
+          <w:rFonts w:ascii="Times New Roman" w:hAnsi="Times New Roman" w:cs="Times New Roman"/>
+          <w:sz w:val="24"/>
+          <w:szCs w:val="24"/>
+        </w:rPr>
+        <w:t>Comativa o apelativa</w:t>
       </w:r>
     </w:p>
     <w:p>
@@ -17682,7 +17539,6 @@
           <w:szCs w:val="24"/>
         </w:rPr>
       </w:pPr>
-      <w:proofErr w:type="spellStart"/>
       <w:r>
         <w:rPr>
           <w:rFonts w:ascii="Times New Roman" w:hAnsi="Times New Roman" w:cs="Times New Roman"/>
@@ -17691,7 +17547,6 @@
         </w:rPr>
         <w:t>Diacromía</w:t>
       </w:r>
-      <w:proofErr w:type="spellEnd"/>
     </w:p>
     <w:p>
       <w:pPr>
@@ -17924,25 +17779,7 @@
           <w:sz w:val="24"/>
           <w:szCs w:val="24"/>
         </w:rPr>
-        <w:t xml:space="preserve">La primera unidad segmental de impulso fónico del habla </w:t>
-      </w:r>
-      <w:proofErr w:type="gramStart"/>
-      <w:r>
-        <w:rPr>
-          <w:rFonts w:ascii="Times New Roman" w:hAnsi="Times New Roman" w:cs="Times New Roman"/>
-          <w:sz w:val="24"/>
-          <w:szCs w:val="24"/>
-        </w:rPr>
-        <w:t>real,</w:t>
-      </w:r>
-      <w:proofErr w:type="gramEnd"/>
-      <w:r>
-        <w:rPr>
-          <w:rFonts w:ascii="Times New Roman" w:hAnsi="Times New Roman" w:cs="Times New Roman"/>
-          <w:sz w:val="24"/>
-          <w:szCs w:val="24"/>
-        </w:rPr>
-        <w:t xml:space="preserve"> corresponde a:</w:t>
+        <w:t>La primera unidad segmental de impulso fónico del habla real, corresponde a:</w:t>
       </w:r>
     </w:p>
     <w:p>
@@ -18252,43 +18089,7 @@
           <w:sz w:val="24"/>
           <w:szCs w:val="24"/>
         </w:rPr>
-        <w:t xml:space="preserve">Es la acentuación de palabras que cumplen distintas funciones dentro de una oración, y </w:t>
-      </w:r>
-      <w:proofErr w:type="gramStart"/>
-      <w:r>
-        <w:rPr>
-          <w:rFonts w:ascii="Times New Roman" w:hAnsi="Times New Roman" w:cs="Times New Roman"/>
-          <w:sz w:val="24"/>
-          <w:szCs w:val="24"/>
-        </w:rPr>
-        <w:t>dicha  variación</w:t>
-      </w:r>
-      <w:proofErr w:type="gramEnd"/>
-      <w:r>
-        <w:rPr>
-          <w:rFonts w:ascii="Times New Roman" w:hAnsi="Times New Roman" w:cs="Times New Roman"/>
-          <w:sz w:val="24"/>
-          <w:szCs w:val="24"/>
-        </w:rPr>
-        <w:t xml:space="preserve"> de funciones se distingue por la presencia o ausencia de tilde. Este concepto corresponde a la </w:t>
-      </w:r>
-      <w:proofErr w:type="spellStart"/>
-      <w:r>
-        <w:rPr>
-          <w:rFonts w:ascii="Times New Roman" w:hAnsi="Times New Roman" w:cs="Times New Roman"/>
-          <w:sz w:val="24"/>
-          <w:szCs w:val="24"/>
-        </w:rPr>
-        <w:t>tildación</w:t>
-      </w:r>
-      <w:proofErr w:type="spellEnd"/>
-      <w:r>
-        <w:rPr>
-          <w:rFonts w:ascii="Times New Roman" w:hAnsi="Times New Roman" w:cs="Times New Roman"/>
-          <w:sz w:val="24"/>
-          <w:szCs w:val="24"/>
-        </w:rPr>
-        <w:t xml:space="preserve"> …</w:t>
+        <w:t>Es la acentuación de palabras que cumplen distintas funciones dentro de una oración, y dicha  variación de funciones se distingue por la presencia o ausencia de tilde. Este concepto corresponde a la tildación …</w:t>
       </w:r>
     </w:p>
     <w:p>
@@ -18345,7 +18146,6 @@
           <w:szCs w:val="24"/>
         </w:rPr>
       </w:pPr>
-      <w:proofErr w:type="spellStart"/>
       <w:r>
         <w:rPr>
           <w:rFonts w:ascii="Times New Roman" w:hAnsi="Times New Roman" w:cs="Times New Roman"/>
@@ -18362,7 +18162,6 @@
         </w:rPr>
         <w:t>erética</w:t>
       </w:r>
-      <w:proofErr w:type="spellEnd"/>
     </w:p>
     <w:p>
       <w:pPr>
@@ -18399,7 +18198,6 @@
           <w:szCs w:val="24"/>
         </w:rPr>
       </w:pPr>
-      <w:proofErr w:type="spellStart"/>
       <w:r>
         <w:rPr>
           <w:rFonts w:ascii="Times New Roman" w:hAnsi="Times New Roman" w:cs="Times New Roman"/>
@@ -18408,7 +18206,6 @@
         </w:rPr>
         <w:t>rubórica</w:t>
       </w:r>
-      <w:proofErr w:type="spellEnd"/>
     </w:p>
     <w:p>
       <w:pPr>

</xml_diff>